<commit_message>
Update Nasam bullet (production-ready CV/geospatial models) and refresh CV
Co-Authored-By: Claude Fable 5 <noreply@anthropic.com>
</commit_message>
<xml_diff>
--- a/public/Karim_Khalil_Resume.docx
+++ b/public/Karim_Khalil_Resume.docx
@@ -408,7 +408,7 @@
           <w:sz w:val="20"/>
           <w:szCs w:val="20"/>
         </w:rPr>
-        <w:t xml:space="preserve">Designed and deployed AI-powered APIs using FastAPI to serve real-time computer vision and geospatial AI models.</w:t>
+        <w:t xml:space="preserve">Delivered production-ready computer vision and geospatial AI models, cutting manual analysis time and enabling real-time internal decision-making.</w:t>
       </w:r>
     </w:p>
     <w:p>
@@ -661,6 +661,105 @@
           <w:szCs w:val="20"/>
         </w:rPr>
         <w:t xml:space="preserve">Implemented YOLOv8-based object detection to monitor PPE compliance in industrial environments, reducing manual monitoring by ~30%. (Python, PyTorch, YOLOv8, OpenCV)</w:t>
+      </w:r>
+    </w:p>
+    <w:p>
+      <w:pPr>
+        <w:spacing w:after="20" w:before="80"/>
+      </w:pPr>
+      <w:r>
+        <w:rPr>
+          <w:rFonts w:ascii="Calibri" w:cs="Calibri" w:eastAsia="Calibri" w:hAnsi="Calibri"/>
+          <w:b/>
+          <w:bCs/>
+          <w:sz w:val="20"/>
+          <w:szCs w:val="20"/>
+        </w:rPr>
+        <w:t xml:space="preserve">Human Activity Detection System</w:t>
+      </w:r>
+    </w:p>
+    <w:p>
+      <w:pPr>
+        <w:pStyle w:val="ListParagraph"/>
+        <w:numPr>
+          <w:ilvl w:val="0"/>
+          <w:numId w:val="2"/>
+        </w:numPr>
+        <w:spacing w:after="60"/>
+      </w:pPr>
+      <w:r>
+        <w:rPr>
+          <w:rFonts w:ascii="Calibri" w:cs="Calibri" w:eastAsia="Calibri" w:hAnsi="Calibri"/>
+          <w:sz w:val="20"/>
+          <w:szCs w:val="20"/>
+        </w:rPr>
+        <w:t xml:space="preserve">Built activity recognition models using transfer learning on temporal video data for elderly safety and posture monitoring, delivering real-time inference for continuous surveillance and alerting. (Python, TensorFlow, Keras, OpenCV, Scikit-learn)</w:t>
+      </w:r>
+    </w:p>
+    <w:p>
+      <w:pPr>
+        <w:spacing w:after="20" w:before="80"/>
+      </w:pPr>
+      <w:r>
+        <w:rPr>
+          <w:rFonts w:ascii="Calibri" w:cs="Calibri" w:eastAsia="Calibri" w:hAnsi="Calibri"/>
+          <w:b/>
+          <w:bCs/>
+          <w:sz w:val="20"/>
+          <w:szCs w:val="20"/>
+        </w:rPr>
+        <w:t xml:space="preserve">Restricted Area Intrusion Detection System</w:t>
+      </w:r>
+    </w:p>
+    <w:p>
+      <w:pPr>
+        <w:pStyle w:val="ListParagraph"/>
+        <w:numPr>
+          <w:ilvl w:val="0"/>
+          <w:numId w:val="2"/>
+        </w:numPr>
+        <w:spacing w:after="60"/>
+      </w:pPr>
+      <w:r>
+        <w:rPr>
+          <w:rFonts w:ascii="Calibri" w:cs="Calibri" w:eastAsia="Calibri" w:hAnsi="Calibri"/>
+          <w:sz w:val="20"/>
+          <w:szCs w:val="20"/>
+        </w:rPr>
+        <w:t xml:space="preserve">Developed an AI security system using object detection and motion analysis for factory surveillance, generating real-time alerts with visual overlays and improving response time by ~25%. (Python, OpenCV, YOLOv8, NumPy, Flask)</w:t>
+      </w:r>
+    </w:p>
+    <w:p>
+      <w:pPr>
+        <w:spacing w:after="20" w:before="80"/>
+      </w:pPr>
+      <w:r>
+        <w:rPr>
+          <w:rFonts w:ascii="Calibri" w:cs="Calibri" w:eastAsia="Calibri" w:hAnsi="Calibri"/>
+          <w:b/>
+          <w:bCs/>
+          <w:sz w:val="20"/>
+          <w:szCs w:val="20"/>
+        </w:rPr>
+        <w:t xml:space="preserve">Fire and Smoke Detection System</w:t>
+      </w:r>
+    </w:p>
+    <w:p>
+      <w:pPr>
+        <w:pStyle w:val="ListParagraph"/>
+        <w:numPr>
+          <w:ilvl w:val="0"/>
+          <w:numId w:val="2"/>
+        </w:numPr>
+        <w:spacing w:after="60"/>
+      </w:pPr>
+      <w:r>
+        <w:rPr>
+          <w:rFonts w:ascii="Calibri" w:cs="Calibri" w:eastAsia="Calibri" w:hAnsi="Calibri"/>
+          <w:sz w:val="20"/>
+          <w:szCs w:val="20"/>
+        </w:rPr>
+        <w:t xml:space="preserve">Engineered a CNN-based classifier for early fire and smoke detection across varied environments, optimized for low-latency deployment in smart surveillance pipelines. (Python, TensorFlow, Keras, OpenCV, Pandas, NumPy)</w:t>
       </w:r>
     </w:p>
     <w:p>

</xml_diff>